<commit_message>
More explanations of "confidence interval"
</commit_message>
<xml_diff>
--- a/financial_analysis/chat-gpt/intervalo_confianza_video_3_3_explicado.docx
+++ b/financial_analysis/chat-gpt/intervalo_confianza_video_3_3_explicado.docx
@@ -74,6 +74,7 @@
             <w:pPr>
               <w:pStyle w:val="Normal"/>
               <w:widowControl/>
+              <w:suppressAutoHyphens w:val="true"/>
               <w:spacing w:lineRule="auto" w:line="240" w:before="0" w:after="0"/>
               <w:jc w:val="start"/>
               <w:rPr>
@@ -105,6 +106,7 @@
             <w:pPr>
               <w:pStyle w:val="Normal"/>
               <w:widowControl/>
+              <w:suppressAutoHyphens w:val="true"/>
               <w:spacing w:lineRule="auto" w:line="240" w:before="0" w:after="0"/>
               <w:jc w:val="start"/>
               <w:rPr>
@@ -136,6 +138,7 @@
             <w:pPr>
               <w:pStyle w:val="Normal"/>
               <w:widowControl/>
+              <w:suppressAutoHyphens w:val="true"/>
               <w:spacing w:lineRule="auto" w:line="240" w:before="0" w:after="0"/>
               <w:jc w:val="start"/>
               <w:rPr>
@@ -169,6 +172,7 @@
             <w:pPr>
               <w:pStyle w:val="Normal"/>
               <w:widowControl/>
+              <w:suppressAutoHyphens w:val="true"/>
               <w:spacing w:lineRule="auto" w:line="240" w:before="0" w:after="0"/>
               <w:jc w:val="start"/>
               <w:rPr>
@@ -198,6 +202,7 @@
             <w:pPr>
               <w:pStyle w:val="Normal"/>
               <w:widowControl/>
+              <w:suppressAutoHyphens w:val="true"/>
               <w:spacing w:lineRule="auto" w:line="240" w:before="0" w:after="0"/>
               <w:jc w:val="start"/>
               <w:rPr>
@@ -227,6 +232,7 @@
             <w:pPr>
               <w:pStyle w:val="Normal"/>
               <w:widowControl/>
+              <w:suppressAutoHyphens w:val="true"/>
               <w:spacing w:lineRule="auto" w:line="240" w:before="0" w:after="0"/>
               <w:jc w:val="start"/>
               <w:rPr>
@@ -259,6 +265,7 @@
             <w:pPr>
               <w:pStyle w:val="Normal"/>
               <w:widowControl/>
+              <w:suppressAutoHyphens w:val="true"/>
               <w:spacing w:lineRule="auto" w:line="240" w:before="0" w:after="0"/>
               <w:jc w:val="start"/>
               <w:rPr>
@@ -288,6 +295,7 @@
             <w:pPr>
               <w:pStyle w:val="Normal"/>
               <w:widowControl/>
+              <w:suppressAutoHyphens w:val="true"/>
               <w:spacing w:lineRule="auto" w:line="240" w:before="0" w:after="0"/>
               <w:jc w:val="start"/>
               <w:rPr>
@@ -317,6 +325,7 @@
             <w:pPr>
               <w:pStyle w:val="Normal"/>
               <w:widowControl/>
+              <w:suppressAutoHyphens w:val="true"/>
               <w:spacing w:lineRule="auto" w:line="240" w:before="0" w:after="0"/>
               <w:jc w:val="start"/>
               <w:rPr>
@@ -349,6 +358,7 @@
             <w:pPr>
               <w:pStyle w:val="Normal"/>
               <w:widowControl/>
+              <w:suppressAutoHyphens w:val="true"/>
               <w:spacing w:lineRule="auto" w:line="240" w:before="0" w:after="0"/>
               <w:jc w:val="start"/>
               <w:rPr>
@@ -378,6 +388,7 @@
             <w:pPr>
               <w:pStyle w:val="Normal"/>
               <w:widowControl/>
+              <w:suppressAutoHyphens w:val="true"/>
               <w:spacing w:lineRule="auto" w:line="240" w:before="0" w:after="0"/>
               <w:jc w:val="start"/>
               <w:rPr>
@@ -407,6 +418,7 @@
             <w:pPr>
               <w:pStyle w:val="Normal"/>
               <w:widowControl/>
+              <w:suppressAutoHyphens w:val="true"/>
               <w:spacing w:lineRule="auto" w:line="240" w:before="0" w:after="0"/>
               <w:jc w:val="start"/>
               <w:rPr>
@@ -439,6 +451,7 @@
             <w:pPr>
               <w:pStyle w:val="Normal"/>
               <w:widowControl/>
+              <w:suppressAutoHyphens w:val="true"/>
               <w:spacing w:lineRule="auto" w:line="240" w:before="0" w:after="0"/>
               <w:jc w:val="start"/>
               <w:rPr>
@@ -468,6 +481,7 @@
             <w:pPr>
               <w:pStyle w:val="Normal"/>
               <w:widowControl/>
+              <w:suppressAutoHyphens w:val="true"/>
               <w:spacing w:lineRule="auto" w:line="240" w:before="0" w:after="0"/>
               <w:jc w:val="start"/>
               <w:rPr>
@@ -497,6 +511,7 @@
             <w:pPr>
               <w:pStyle w:val="Normal"/>
               <w:widowControl/>
+              <w:suppressAutoHyphens w:val="true"/>
               <w:spacing w:lineRule="auto" w:line="240" w:before="0" w:after="0"/>
               <w:jc w:val="start"/>
               <w:rPr>
@@ -529,6 +544,7 @@
             <w:pPr>
               <w:pStyle w:val="Normal"/>
               <w:widowControl/>
+              <w:suppressAutoHyphens w:val="true"/>
               <w:spacing w:lineRule="auto" w:line="240" w:before="0" w:after="0"/>
               <w:jc w:val="start"/>
               <w:rPr>
@@ -558,6 +574,7 @@
             <w:pPr>
               <w:pStyle w:val="Normal"/>
               <w:widowControl/>
+              <w:suppressAutoHyphens w:val="true"/>
               <w:spacing w:lineRule="auto" w:line="240" w:before="0" w:after="0"/>
               <w:jc w:val="start"/>
               <w:rPr>
@@ -587,6 +604,7 @@
             <w:pPr>
               <w:pStyle w:val="Normal"/>
               <w:widowControl/>
+              <w:suppressAutoHyphens w:val="true"/>
               <w:spacing w:lineRule="auto" w:line="240" w:before="0" w:after="0"/>
               <w:jc w:val="start"/>
               <w:rPr>
@@ -619,6 +637,7 @@
             <w:pPr>
               <w:pStyle w:val="Normal"/>
               <w:widowControl/>
+              <w:suppressAutoHyphens w:val="true"/>
               <w:spacing w:lineRule="auto" w:line="240" w:before="0" w:after="0"/>
               <w:jc w:val="start"/>
               <w:rPr>
@@ -648,6 +667,7 @@
             <w:pPr>
               <w:pStyle w:val="Normal"/>
               <w:widowControl/>
+              <w:suppressAutoHyphens w:val="true"/>
               <w:spacing w:lineRule="auto" w:line="240" w:before="0" w:after="0"/>
               <w:jc w:val="start"/>
               <w:rPr>
@@ -677,6 +697,7 @@
             <w:pPr>
               <w:pStyle w:val="Normal"/>
               <w:widowControl/>
+              <w:suppressAutoHyphens w:val="true"/>
               <w:spacing w:lineRule="auto" w:line="240" w:before="0" w:after="0"/>
               <w:jc w:val="start"/>
               <w:rPr>
@@ -799,6 +820,7 @@
             <w:pPr>
               <w:pStyle w:val="Normal"/>
               <w:widowControl/>
+              <w:suppressAutoHyphens w:val="true"/>
               <w:spacing w:lineRule="auto" w:line="240" w:before="0" w:after="0"/>
               <w:jc w:val="start"/>
               <w:rPr>
@@ -829,6 +851,7 @@
             <w:pPr>
               <w:pStyle w:val="Normal"/>
               <w:widowControl/>
+              <w:suppressAutoHyphens w:val="true"/>
               <w:spacing w:lineRule="auto" w:line="240" w:before="0" w:after="0"/>
               <w:jc w:val="start"/>
               <w:rPr>
@@ -863,6 +886,7 @@
             <w:pPr>
               <w:pStyle w:val="Normal"/>
               <w:widowControl/>
+              <w:suppressAutoHyphens w:val="true"/>
               <w:spacing w:lineRule="auto" w:line="240" w:before="0" w:after="0"/>
               <w:jc w:val="start"/>
               <w:rPr>
@@ -893,6 +917,7 @@
             <w:pPr>
               <w:pStyle w:val="Normal"/>
               <w:widowControl/>
+              <w:suppressAutoHyphens w:val="true"/>
               <w:spacing w:lineRule="auto" w:line="240" w:before="0" w:after="0"/>
               <w:jc w:val="start"/>
               <w:rPr>
@@ -927,6 +952,7 @@
             <w:pPr>
               <w:pStyle w:val="Normal"/>
               <w:widowControl/>
+              <w:suppressAutoHyphens w:val="true"/>
               <w:spacing w:lineRule="auto" w:line="240" w:before="0" w:after="0"/>
               <w:jc w:val="start"/>
               <w:rPr>
@@ -957,6 +983,7 @@
             <w:pPr>
               <w:pStyle w:val="Normal"/>
               <w:widowControl/>
+              <w:suppressAutoHyphens w:val="true"/>
               <w:spacing w:lineRule="auto" w:line="240" w:before="0" w:after="0"/>
               <w:jc w:val="start"/>
               <w:rPr>
@@ -1046,6 +1073,7 @@
             <w:pPr>
               <w:pStyle w:val="Normal"/>
               <w:widowControl/>
+              <w:suppressAutoHyphens w:val="true"/>
               <w:spacing w:lineRule="auto" w:line="240" w:before="0" w:after="0"/>
               <w:jc w:val="start"/>
               <w:rPr>
@@ -1076,6 +1104,7 @@
             <w:pPr>
               <w:pStyle w:val="Normal"/>
               <w:widowControl/>
+              <w:suppressAutoHyphens w:val="true"/>
               <w:spacing w:lineRule="auto" w:line="240" w:before="0" w:after="0"/>
               <w:jc w:val="start"/>
               <w:rPr>
@@ -1110,6 +1139,7 @@
             <w:pPr>
               <w:pStyle w:val="Normal"/>
               <w:widowControl/>
+              <w:suppressAutoHyphens w:val="true"/>
               <w:spacing w:lineRule="auto" w:line="240" w:before="0" w:after="0"/>
               <w:jc w:val="start"/>
               <w:rPr>
@@ -1140,6 +1170,7 @@
             <w:pPr>
               <w:pStyle w:val="Normal"/>
               <w:widowControl/>
+              <w:suppressAutoHyphens w:val="true"/>
               <w:spacing w:lineRule="auto" w:line="240" w:before="0" w:after="0"/>
               <w:jc w:val="start"/>
               <w:rPr>
@@ -1174,6 +1205,7 @@
             <w:pPr>
               <w:pStyle w:val="Normal"/>
               <w:widowControl/>
+              <w:suppressAutoHyphens w:val="true"/>
               <w:spacing w:lineRule="auto" w:line="240" w:before="0" w:after="0"/>
               <w:jc w:val="start"/>
               <w:rPr>
@@ -1204,6 +1236,7 @@
             <w:pPr>
               <w:pStyle w:val="Normal"/>
               <w:widowControl/>
+              <w:suppressAutoHyphens w:val="true"/>
               <w:spacing w:lineRule="auto" w:line="240" w:before="0" w:after="0"/>
               <w:jc w:val="start"/>
               <w:rPr>
@@ -1341,6 +1374,7 @@
             <w:pPr>
               <w:pStyle w:val="Normal"/>
               <w:widowControl/>
+              <w:suppressAutoHyphens w:val="true"/>
               <w:spacing w:lineRule="auto" w:line="240" w:before="0" w:after="0"/>
               <w:jc w:val="start"/>
               <w:rPr>
@@ -1371,6 +1405,7 @@
             <w:pPr>
               <w:pStyle w:val="Normal"/>
               <w:widowControl/>
+              <w:suppressAutoHyphens w:val="true"/>
               <w:spacing w:lineRule="auto" w:line="240" w:before="0" w:after="0"/>
               <w:jc w:val="start"/>
               <w:rPr>
@@ -1405,6 +1440,7 @@
             <w:pPr>
               <w:pStyle w:val="Normal"/>
               <w:widowControl/>
+              <w:suppressAutoHyphens w:val="true"/>
               <w:spacing w:lineRule="auto" w:line="240" w:before="0" w:after="0"/>
               <w:jc w:val="start"/>
               <w:rPr>
@@ -1435,6 +1471,7 @@
             <w:pPr>
               <w:pStyle w:val="Normal"/>
               <w:widowControl/>
+              <w:suppressAutoHyphens w:val="true"/>
               <w:spacing w:lineRule="auto" w:line="240" w:before="0" w:after="0"/>
               <w:jc w:val="start"/>
               <w:rPr>
@@ -1469,6 +1506,7 @@
             <w:pPr>
               <w:pStyle w:val="Normal"/>
               <w:widowControl/>
+              <w:suppressAutoHyphens w:val="true"/>
               <w:spacing w:lineRule="auto" w:line="240" w:before="0" w:after="0"/>
               <w:jc w:val="start"/>
               <w:rPr>
@@ -1499,6 +1537,7 @@
             <w:pPr>
               <w:pStyle w:val="Normal"/>
               <w:widowControl/>
+              <w:suppressAutoHyphens w:val="true"/>
               <w:spacing w:lineRule="auto" w:line="240" w:before="0" w:after="0"/>
               <w:jc w:val="start"/>
               <w:rPr>
@@ -1553,6 +1592,7 @@
     <w:p>
       <w:pPr>
         <w:pStyle w:val="Normal"/>
+        <w:spacing w:before="0" w:after="200"/>
         <w:rPr/>
       </w:pPr>
       <w:r>
@@ -1600,6 +1640,7 @@
             <w:pPr>
               <w:pStyle w:val="Normal"/>
               <w:widowControl/>
+              <w:suppressAutoHyphens w:val="true"/>
               <w:spacing w:lineRule="auto" w:line="240" w:before="0" w:after="0"/>
               <w:jc w:val="start"/>
               <w:rPr>
@@ -1630,6 +1671,7 @@
             <w:pPr>
               <w:pStyle w:val="Normal"/>
               <w:widowControl/>
+              <w:suppressAutoHyphens w:val="true"/>
               <w:spacing w:lineRule="auto" w:line="240" w:before="0" w:after="0"/>
               <w:jc w:val="start"/>
               <w:rPr>
@@ -1664,6 +1706,7 @@
             <w:pPr>
               <w:pStyle w:val="Normal"/>
               <w:widowControl/>
+              <w:suppressAutoHyphens w:val="true"/>
               <w:spacing w:lineRule="auto" w:line="240" w:before="0" w:after="0"/>
               <w:jc w:val="start"/>
               <w:rPr>
@@ -1694,6 +1737,7 @@
             <w:pPr>
               <w:pStyle w:val="Normal"/>
               <w:widowControl/>
+              <w:suppressAutoHyphens w:val="true"/>
               <w:spacing w:lineRule="auto" w:line="240" w:before="0" w:after="0"/>
               <w:jc w:val="start"/>
               <w:rPr>
@@ -1728,6 +1772,7 @@
             <w:pPr>
               <w:pStyle w:val="Normal"/>
               <w:widowControl/>
+              <w:suppressAutoHyphens w:val="true"/>
               <w:spacing w:lineRule="auto" w:line="240" w:before="0" w:after="0"/>
               <w:jc w:val="start"/>
               <w:rPr>
@@ -1758,6 +1803,7 @@
             <w:pPr>
               <w:pStyle w:val="Normal"/>
               <w:widowControl/>
+              <w:suppressAutoHyphens w:val="true"/>
               <w:spacing w:lineRule="auto" w:line="240" w:before="0" w:after="0"/>
               <w:jc w:val="start"/>
               <w:rPr>
@@ -1895,6 +1941,7 @@
             <w:pPr>
               <w:pStyle w:val="Normal"/>
               <w:widowControl/>
+              <w:suppressAutoHyphens w:val="true"/>
               <w:spacing w:lineRule="auto" w:line="240" w:before="0" w:after="0"/>
               <w:jc w:val="start"/>
               <w:rPr>
@@ -1925,6 +1972,7 @@
             <w:pPr>
               <w:pStyle w:val="Normal"/>
               <w:widowControl/>
+              <w:suppressAutoHyphens w:val="true"/>
               <w:spacing w:lineRule="auto" w:line="240" w:before="0" w:after="0"/>
               <w:jc w:val="start"/>
               <w:rPr>
@@ -1959,6 +2007,7 @@
             <w:pPr>
               <w:pStyle w:val="Normal"/>
               <w:widowControl/>
+              <w:suppressAutoHyphens w:val="true"/>
               <w:spacing w:lineRule="auto" w:line="240" w:before="0" w:after="0"/>
               <w:jc w:val="start"/>
               <w:rPr>
@@ -1989,6 +2038,7 @@
             <w:pPr>
               <w:pStyle w:val="Normal"/>
               <w:widowControl/>
+              <w:suppressAutoHyphens w:val="true"/>
               <w:spacing w:lineRule="auto" w:line="240" w:before="0" w:after="0"/>
               <w:jc w:val="start"/>
               <w:rPr>
@@ -2023,6 +2073,7 @@
             <w:pPr>
               <w:pStyle w:val="Normal"/>
               <w:widowControl/>
+              <w:suppressAutoHyphens w:val="true"/>
               <w:spacing w:lineRule="auto" w:line="240" w:before="0" w:after="0"/>
               <w:jc w:val="start"/>
               <w:rPr>
@@ -2053,6 +2104,7 @@
             <w:pPr>
               <w:pStyle w:val="Normal"/>
               <w:widowControl/>
+              <w:suppressAutoHyphens w:val="true"/>
               <w:spacing w:lineRule="auto" w:line="240" w:before="0" w:after="0"/>
               <w:jc w:val="start"/>
               <w:rPr>
@@ -2090,6 +2142,18 @@
       <w:r>
         <w:rPr/>
         <w:t>Z = 1 significa una desviacion estandar por encima del centro. Z = -1 significa una desviacion estandar por debajo.</w:t>
+      </w:r>
+    </w:p>
+    <w:p>
+      <w:pPr>
+        <w:pStyle w:val="Normal"/>
+        <w:rPr/>
+      </w:pPr>
+      <w:r>
+        <w:rPr/>
+      </w:r>
+      <w:r>
+        <w:br w:type="page"/>
       </w:r>
     </w:p>
     <w:p>
@@ -2142,6 +2206,7 @@
             <w:pPr>
               <w:pStyle w:val="Normal"/>
               <w:widowControl/>
+              <w:suppressAutoHyphens w:val="true"/>
               <w:spacing w:lineRule="auto" w:line="240" w:before="0" w:after="0"/>
               <w:jc w:val="start"/>
               <w:rPr>
@@ -2172,6 +2237,7 @@
             <w:pPr>
               <w:pStyle w:val="Normal"/>
               <w:widowControl/>
+              <w:suppressAutoHyphens w:val="true"/>
               <w:spacing w:lineRule="auto" w:line="240" w:before="0" w:after="0"/>
               <w:jc w:val="start"/>
               <w:rPr>
@@ -2206,6 +2272,7 @@
             <w:pPr>
               <w:pStyle w:val="Normal"/>
               <w:widowControl/>
+              <w:suppressAutoHyphens w:val="true"/>
               <w:spacing w:lineRule="auto" w:line="240" w:before="0" w:after="0"/>
               <w:jc w:val="start"/>
               <w:rPr>
@@ -2236,6 +2303,7 @@
             <w:pPr>
               <w:pStyle w:val="Normal"/>
               <w:widowControl/>
+              <w:suppressAutoHyphens w:val="true"/>
               <w:spacing w:lineRule="auto" w:line="240" w:before="0" w:after="0"/>
               <w:jc w:val="start"/>
               <w:rPr>
@@ -2270,6 +2338,7 @@
             <w:pPr>
               <w:pStyle w:val="Normal"/>
               <w:widowControl/>
+              <w:suppressAutoHyphens w:val="true"/>
               <w:spacing w:lineRule="auto" w:line="240" w:before="0" w:after="0"/>
               <w:jc w:val="start"/>
               <w:rPr>
@@ -2300,6 +2369,7 @@
             <w:pPr>
               <w:pStyle w:val="Normal"/>
               <w:widowControl/>
+              <w:suppressAutoHyphens w:val="true"/>
               <w:spacing w:lineRule="auto" w:line="240" w:before="0" w:after="0"/>
               <w:jc w:val="start"/>
               <w:rPr>
@@ -2437,6 +2507,7 @@
             <w:pPr>
               <w:pStyle w:val="Normal"/>
               <w:widowControl/>
+              <w:suppressAutoHyphens w:val="true"/>
               <w:spacing w:lineRule="auto" w:line="240" w:before="0" w:after="0"/>
               <w:jc w:val="start"/>
               <w:rPr>
@@ -2467,6 +2538,7 @@
             <w:pPr>
               <w:pStyle w:val="Normal"/>
               <w:widowControl/>
+              <w:suppressAutoHyphens w:val="true"/>
               <w:spacing w:lineRule="auto" w:line="240" w:before="0" w:after="0"/>
               <w:jc w:val="start"/>
               <w:rPr>
@@ -2501,6 +2573,7 @@
             <w:pPr>
               <w:pStyle w:val="Normal"/>
               <w:widowControl/>
+              <w:suppressAutoHyphens w:val="true"/>
               <w:spacing w:lineRule="auto" w:line="240" w:before="0" w:after="0"/>
               <w:jc w:val="start"/>
               <w:rPr>
@@ -2531,6 +2604,7 @@
             <w:pPr>
               <w:pStyle w:val="Normal"/>
               <w:widowControl/>
+              <w:suppressAutoHyphens w:val="true"/>
               <w:spacing w:lineRule="auto" w:line="240" w:before="0" w:after="0"/>
               <w:jc w:val="start"/>
               <w:rPr>
@@ -2565,6 +2639,7 @@
             <w:pPr>
               <w:pStyle w:val="Normal"/>
               <w:widowControl/>
+              <w:suppressAutoHyphens w:val="true"/>
               <w:spacing w:lineRule="auto" w:line="240" w:before="0" w:after="0"/>
               <w:jc w:val="start"/>
               <w:rPr>
@@ -2595,6 +2670,7 @@
             <w:pPr>
               <w:pStyle w:val="Normal"/>
               <w:widowControl/>
+              <w:suppressAutoHyphens w:val="true"/>
               <w:spacing w:lineRule="auto" w:line="240" w:before="0" w:after="0"/>
               <w:jc w:val="start"/>
               <w:rPr>
@@ -2684,6 +2760,7 @@
             <w:pPr>
               <w:pStyle w:val="Normal"/>
               <w:widowControl/>
+              <w:suppressAutoHyphens w:val="true"/>
               <w:spacing w:lineRule="auto" w:line="240" w:before="0" w:after="0"/>
               <w:jc w:val="start"/>
               <w:rPr>
@@ -2714,6 +2791,7 @@
             <w:pPr>
               <w:pStyle w:val="Normal"/>
               <w:widowControl/>
+              <w:suppressAutoHyphens w:val="true"/>
               <w:spacing w:lineRule="auto" w:line="240" w:before="0" w:after="0"/>
               <w:jc w:val="start"/>
               <w:rPr>
@@ -2748,6 +2826,7 @@
             <w:pPr>
               <w:pStyle w:val="Normal"/>
               <w:widowControl/>
+              <w:suppressAutoHyphens w:val="true"/>
               <w:spacing w:lineRule="auto" w:line="240" w:before="0" w:after="0"/>
               <w:jc w:val="start"/>
               <w:rPr>
@@ -2778,6 +2857,7 @@
             <w:pPr>
               <w:pStyle w:val="Normal"/>
               <w:widowControl/>
+              <w:suppressAutoHyphens w:val="true"/>
               <w:spacing w:lineRule="auto" w:line="240" w:before="0" w:after="0"/>
               <w:jc w:val="start"/>
               <w:rPr>
@@ -2812,6 +2892,7 @@
             <w:pPr>
               <w:pStyle w:val="Normal"/>
               <w:widowControl/>
+              <w:suppressAutoHyphens w:val="true"/>
               <w:spacing w:lineRule="auto" w:line="240" w:before="0" w:after="0"/>
               <w:jc w:val="start"/>
               <w:rPr>
@@ -2842,6 +2923,7 @@
             <w:pPr>
               <w:pStyle w:val="Normal"/>
               <w:widowControl/>
+              <w:suppressAutoHyphens w:val="true"/>
               <w:spacing w:lineRule="auto" w:line="240" w:before="0" w:after="0"/>
               <w:jc w:val="start"/>
               <w:rPr>
@@ -2979,6 +3061,7 @@
             <w:pPr>
               <w:pStyle w:val="Normal"/>
               <w:widowControl/>
+              <w:suppressAutoHyphens w:val="true"/>
               <w:spacing w:lineRule="auto" w:line="240" w:before="0" w:after="0"/>
               <w:jc w:val="start"/>
               <w:rPr>
@@ -3009,6 +3092,7 @@
             <w:pPr>
               <w:pStyle w:val="Normal"/>
               <w:widowControl/>
+              <w:suppressAutoHyphens w:val="true"/>
               <w:spacing w:lineRule="auto" w:line="240" w:before="0" w:after="0"/>
               <w:jc w:val="start"/>
               <w:rPr>
@@ -3043,6 +3127,7 @@
             <w:pPr>
               <w:pStyle w:val="Normal"/>
               <w:widowControl/>
+              <w:suppressAutoHyphens w:val="true"/>
               <w:spacing w:lineRule="auto" w:line="240" w:before="0" w:after="0"/>
               <w:jc w:val="start"/>
               <w:rPr>
@@ -3073,6 +3158,7 @@
             <w:pPr>
               <w:pStyle w:val="Normal"/>
               <w:widowControl/>
+              <w:suppressAutoHyphens w:val="true"/>
               <w:spacing w:lineRule="auto" w:line="240" w:before="0" w:after="0"/>
               <w:jc w:val="start"/>
               <w:rPr>
@@ -3107,6 +3193,7 @@
             <w:pPr>
               <w:pStyle w:val="Normal"/>
               <w:widowControl/>
+              <w:suppressAutoHyphens w:val="true"/>
               <w:spacing w:lineRule="auto" w:line="240" w:before="0" w:after="0"/>
               <w:jc w:val="start"/>
               <w:rPr>
@@ -3137,6 +3224,7 @@
             <w:pPr>
               <w:pStyle w:val="Normal"/>
               <w:widowControl/>
+              <w:suppressAutoHyphens w:val="true"/>
               <w:spacing w:lineRule="auto" w:line="240" w:before="0" w:after="0"/>
               <w:jc w:val="start"/>
               <w:rPr>
@@ -3226,6 +3314,7 @@
             <w:pPr>
               <w:pStyle w:val="Normal"/>
               <w:widowControl/>
+              <w:suppressAutoHyphens w:val="true"/>
               <w:spacing w:lineRule="auto" w:line="240" w:before="0" w:after="0"/>
               <w:jc w:val="start"/>
               <w:rPr>
@@ -3256,6 +3345,7 @@
             <w:pPr>
               <w:pStyle w:val="Normal"/>
               <w:widowControl/>
+              <w:suppressAutoHyphens w:val="true"/>
               <w:spacing w:lineRule="auto" w:line="240" w:before="0" w:after="0"/>
               <w:jc w:val="start"/>
               <w:rPr>
@@ -3290,6 +3380,7 @@
             <w:pPr>
               <w:pStyle w:val="Normal"/>
               <w:widowControl/>
+              <w:suppressAutoHyphens w:val="true"/>
               <w:spacing w:lineRule="auto" w:line="240" w:before="0" w:after="0"/>
               <w:jc w:val="start"/>
               <w:rPr>
@@ -3320,6 +3411,7 @@
             <w:pPr>
               <w:pStyle w:val="Normal"/>
               <w:widowControl/>
+              <w:suppressAutoHyphens w:val="true"/>
               <w:spacing w:lineRule="auto" w:line="240" w:before="0" w:after="0"/>
               <w:jc w:val="start"/>
               <w:rPr>
@@ -3354,6 +3446,7 @@
             <w:pPr>
               <w:pStyle w:val="Normal"/>
               <w:widowControl/>
+              <w:suppressAutoHyphens w:val="true"/>
               <w:spacing w:lineRule="auto" w:line="240" w:before="0" w:after="0"/>
               <w:jc w:val="start"/>
               <w:rPr>
@@ -3384,6 +3477,7 @@
             <w:pPr>
               <w:pStyle w:val="Normal"/>
               <w:widowControl/>
+              <w:suppressAutoHyphens w:val="true"/>
               <w:spacing w:lineRule="auto" w:line="240" w:before="0" w:after="0"/>
               <w:jc w:val="start"/>
               <w:rPr>
@@ -3473,6 +3567,7 @@
             <w:pPr>
               <w:pStyle w:val="Normal"/>
               <w:widowControl/>
+              <w:suppressAutoHyphens w:val="true"/>
               <w:spacing w:lineRule="auto" w:line="240" w:before="0" w:after="0"/>
               <w:jc w:val="start"/>
               <w:rPr>
@@ -3503,6 +3598,7 @@
             <w:pPr>
               <w:pStyle w:val="Normal"/>
               <w:widowControl/>
+              <w:suppressAutoHyphens w:val="true"/>
               <w:spacing w:lineRule="auto" w:line="240" w:before="0" w:after="0"/>
               <w:jc w:val="start"/>
               <w:rPr>
@@ -3537,6 +3633,7 @@
             <w:pPr>
               <w:pStyle w:val="Normal"/>
               <w:widowControl/>
+              <w:suppressAutoHyphens w:val="true"/>
               <w:spacing w:lineRule="auto" w:line="240" w:before="0" w:after="0"/>
               <w:jc w:val="start"/>
               <w:rPr>
@@ -3567,6 +3664,7 @@
             <w:pPr>
               <w:pStyle w:val="Normal"/>
               <w:widowControl/>
+              <w:suppressAutoHyphens w:val="true"/>
               <w:spacing w:lineRule="auto" w:line="240" w:before="0" w:after="0"/>
               <w:jc w:val="start"/>
               <w:rPr>
@@ -3601,6 +3699,7 @@
             <w:pPr>
               <w:pStyle w:val="Normal"/>
               <w:widowControl/>
+              <w:suppressAutoHyphens w:val="true"/>
               <w:spacing w:lineRule="auto" w:line="240" w:before="0" w:after="0"/>
               <w:jc w:val="start"/>
               <w:rPr>
@@ -3631,6 +3730,7 @@
             <w:pPr>
               <w:pStyle w:val="Normal"/>
               <w:widowControl/>
+              <w:suppressAutoHyphens w:val="true"/>
               <w:spacing w:lineRule="auto" w:line="240" w:before="0" w:after="0"/>
               <w:jc w:val="start"/>
               <w:rPr>
@@ -3720,6 +3820,7 @@
             <w:pPr>
               <w:pStyle w:val="Normal"/>
               <w:widowControl/>
+              <w:suppressAutoHyphens w:val="true"/>
               <w:spacing w:lineRule="auto" w:line="240" w:before="0" w:after="0"/>
               <w:jc w:val="start"/>
               <w:rPr>
@@ -3750,6 +3851,7 @@
             <w:pPr>
               <w:pStyle w:val="Normal"/>
               <w:widowControl/>
+              <w:suppressAutoHyphens w:val="true"/>
               <w:spacing w:lineRule="auto" w:line="240" w:before="0" w:after="0"/>
               <w:jc w:val="start"/>
               <w:rPr>
@@ -3784,6 +3886,7 @@
             <w:pPr>
               <w:pStyle w:val="Normal"/>
               <w:widowControl/>
+              <w:suppressAutoHyphens w:val="true"/>
               <w:spacing w:lineRule="auto" w:line="240" w:before="0" w:after="0"/>
               <w:jc w:val="start"/>
               <w:rPr>
@@ -3814,6 +3917,7 @@
             <w:pPr>
               <w:pStyle w:val="Normal"/>
               <w:widowControl/>
+              <w:suppressAutoHyphens w:val="true"/>
               <w:spacing w:lineRule="auto" w:line="240" w:before="0" w:after="0"/>
               <w:jc w:val="start"/>
               <w:rPr>
@@ -3848,6 +3952,7 @@
             <w:pPr>
               <w:pStyle w:val="Normal"/>
               <w:widowControl/>
+              <w:suppressAutoHyphens w:val="true"/>
               <w:spacing w:lineRule="auto" w:line="240" w:before="0" w:after="0"/>
               <w:jc w:val="start"/>
               <w:rPr>
@@ -3878,6 +3983,7 @@
             <w:pPr>
               <w:pStyle w:val="Normal"/>
               <w:widowControl/>
+              <w:suppressAutoHyphens w:val="true"/>
               <w:spacing w:lineRule="auto" w:line="240" w:before="0" w:after="0"/>
               <w:jc w:val="start"/>
               <w:rPr>
@@ -3967,6 +4073,7 @@
             <w:pPr>
               <w:pStyle w:val="Normal"/>
               <w:widowControl/>
+              <w:suppressAutoHyphens w:val="true"/>
               <w:spacing w:lineRule="auto" w:line="240" w:before="0" w:after="0"/>
               <w:jc w:val="start"/>
               <w:rPr>
@@ -3997,6 +4104,7 @@
             <w:pPr>
               <w:pStyle w:val="Normal"/>
               <w:widowControl/>
+              <w:suppressAutoHyphens w:val="true"/>
               <w:spacing w:lineRule="auto" w:line="240" w:before="0" w:after="0"/>
               <w:jc w:val="start"/>
               <w:rPr>
@@ -4031,6 +4139,7 @@
             <w:pPr>
               <w:pStyle w:val="Normal"/>
               <w:widowControl/>
+              <w:suppressAutoHyphens w:val="true"/>
               <w:spacing w:lineRule="auto" w:line="240" w:before="0" w:after="0"/>
               <w:jc w:val="start"/>
               <w:rPr>
@@ -4061,6 +4170,7 @@
             <w:pPr>
               <w:pStyle w:val="Normal"/>
               <w:widowControl/>
+              <w:suppressAutoHyphens w:val="true"/>
               <w:spacing w:lineRule="auto" w:line="240" w:before="0" w:after="0"/>
               <w:jc w:val="start"/>
               <w:rPr>
@@ -4095,6 +4205,7 @@
             <w:pPr>
               <w:pStyle w:val="Normal"/>
               <w:widowControl/>
+              <w:suppressAutoHyphens w:val="true"/>
               <w:spacing w:lineRule="auto" w:line="240" w:before="0" w:after="0"/>
               <w:jc w:val="start"/>
               <w:rPr>
@@ -4125,6 +4236,7 @@
             <w:pPr>
               <w:pStyle w:val="Normal"/>
               <w:widowControl/>
+              <w:suppressAutoHyphens w:val="true"/>
               <w:spacing w:lineRule="auto" w:line="240" w:before="0" w:after="0"/>
               <w:jc w:val="start"/>
               <w:rPr>
@@ -4214,6 +4326,7 @@
             <w:pPr>
               <w:pStyle w:val="Normal"/>
               <w:widowControl/>
+              <w:suppressAutoHyphens w:val="true"/>
               <w:spacing w:lineRule="auto" w:line="240" w:before="0" w:after="0"/>
               <w:jc w:val="start"/>
               <w:rPr>
@@ -4244,6 +4357,7 @@
             <w:pPr>
               <w:pStyle w:val="Normal"/>
               <w:widowControl/>
+              <w:suppressAutoHyphens w:val="true"/>
               <w:spacing w:lineRule="auto" w:line="240" w:before="0" w:after="0"/>
               <w:jc w:val="start"/>
               <w:rPr>
@@ -4278,6 +4392,7 @@
             <w:pPr>
               <w:pStyle w:val="Normal"/>
               <w:widowControl/>
+              <w:suppressAutoHyphens w:val="true"/>
               <w:spacing w:lineRule="auto" w:line="240" w:before="0" w:after="0"/>
               <w:jc w:val="start"/>
               <w:rPr>
@@ -4308,6 +4423,7 @@
             <w:pPr>
               <w:pStyle w:val="Normal"/>
               <w:widowControl/>
+              <w:suppressAutoHyphens w:val="true"/>
               <w:spacing w:lineRule="auto" w:line="240" w:before="0" w:after="0"/>
               <w:jc w:val="start"/>
               <w:rPr>
@@ -4342,6 +4458,7 @@
             <w:pPr>
               <w:pStyle w:val="Normal"/>
               <w:widowControl/>
+              <w:suppressAutoHyphens w:val="true"/>
               <w:spacing w:lineRule="auto" w:line="240" w:before="0" w:after="0"/>
               <w:jc w:val="start"/>
               <w:rPr>
@@ -4372,6 +4489,7 @@
             <w:pPr>
               <w:pStyle w:val="Normal"/>
               <w:widowControl/>
+              <w:suppressAutoHyphens w:val="true"/>
               <w:spacing w:lineRule="auto" w:line="240" w:before="0" w:after="0"/>
               <w:jc w:val="start"/>
               <w:rPr>
@@ -4461,6 +4579,7 @@
             <w:pPr>
               <w:pStyle w:val="Normal"/>
               <w:widowControl/>
+              <w:suppressAutoHyphens w:val="true"/>
               <w:spacing w:lineRule="auto" w:line="240" w:before="0" w:after="0"/>
               <w:jc w:val="start"/>
               <w:rPr>
@@ -4491,6 +4610,7 @@
             <w:pPr>
               <w:pStyle w:val="Normal"/>
               <w:widowControl/>
+              <w:suppressAutoHyphens w:val="true"/>
               <w:spacing w:lineRule="auto" w:line="240" w:before="0" w:after="0"/>
               <w:jc w:val="start"/>
               <w:rPr>
@@ -4525,6 +4645,7 @@
             <w:pPr>
               <w:pStyle w:val="Normal"/>
               <w:widowControl/>
+              <w:suppressAutoHyphens w:val="true"/>
               <w:spacing w:lineRule="auto" w:line="240" w:before="0" w:after="0"/>
               <w:jc w:val="start"/>
               <w:rPr>
@@ -4555,6 +4676,7 @@
             <w:pPr>
               <w:pStyle w:val="Normal"/>
               <w:widowControl/>
+              <w:suppressAutoHyphens w:val="true"/>
               <w:spacing w:lineRule="auto" w:line="240" w:before="0" w:after="0"/>
               <w:jc w:val="start"/>
               <w:rPr>
@@ -4589,6 +4711,7 @@
             <w:pPr>
               <w:pStyle w:val="Normal"/>
               <w:widowControl/>
+              <w:suppressAutoHyphens w:val="true"/>
               <w:spacing w:lineRule="auto" w:line="240" w:before="0" w:after="0"/>
               <w:jc w:val="start"/>
               <w:rPr>
@@ -4619,6 +4742,7 @@
             <w:pPr>
               <w:pStyle w:val="Normal"/>
               <w:widowControl/>
+              <w:suppressAutoHyphens w:val="true"/>
               <w:spacing w:lineRule="auto" w:line="240" w:before="0" w:after="0"/>
               <w:jc w:val="start"/>
               <w:rPr>
@@ -4768,6 +4892,7 @@
             <w:pPr>
               <w:pStyle w:val="Normal"/>
               <w:widowControl/>
+              <w:suppressAutoHyphens w:val="true"/>
               <w:spacing w:lineRule="auto" w:line="240" w:before="0" w:after="0"/>
               <w:jc w:val="start"/>
               <w:rPr>
@@ -4799,6 +4924,7 @@
             <w:pPr>
               <w:pStyle w:val="Normal"/>
               <w:widowControl/>
+              <w:suppressAutoHyphens w:val="true"/>
               <w:spacing w:lineRule="auto" w:line="240" w:before="0" w:after="0"/>
               <w:jc w:val="start"/>
               <w:rPr>
@@ -4830,6 +4956,7 @@
             <w:pPr>
               <w:pStyle w:val="Normal"/>
               <w:widowControl/>
+              <w:suppressAutoHyphens w:val="true"/>
               <w:spacing w:lineRule="auto" w:line="240" w:before="0" w:after="0"/>
               <w:jc w:val="start"/>
               <w:rPr>
@@ -4861,6 +4988,7 @@
             <w:pPr>
               <w:pStyle w:val="Normal"/>
               <w:widowControl/>
+              <w:suppressAutoHyphens w:val="true"/>
               <w:spacing w:lineRule="auto" w:line="240" w:before="0" w:after="0"/>
               <w:jc w:val="start"/>
               <w:rPr>
@@ -4894,6 +5022,7 @@
             <w:pPr>
               <w:pStyle w:val="Normal"/>
               <w:widowControl/>
+              <w:suppressAutoHyphens w:val="true"/>
               <w:spacing w:lineRule="auto" w:line="240" w:before="0" w:after="0"/>
               <w:jc w:val="start"/>
               <w:rPr>
@@ -4923,6 +5052,7 @@
             <w:pPr>
               <w:pStyle w:val="Normal"/>
               <w:widowControl/>
+              <w:suppressAutoHyphens w:val="true"/>
               <w:spacing w:lineRule="auto" w:line="240" w:before="0" w:after="0"/>
               <w:jc w:val="start"/>
               <w:rPr>
@@ -4952,6 +5082,7 @@
             <w:pPr>
               <w:pStyle w:val="Normal"/>
               <w:widowControl/>
+              <w:suppressAutoHyphens w:val="true"/>
               <w:spacing w:lineRule="auto" w:line="240" w:before="0" w:after="0"/>
               <w:jc w:val="start"/>
               <w:rPr>
@@ -4981,6 +5112,7 @@
             <w:pPr>
               <w:pStyle w:val="Normal"/>
               <w:widowControl/>
+              <w:suppressAutoHyphens w:val="true"/>
               <w:spacing w:lineRule="auto" w:line="240" w:before="0" w:after="0"/>
               <w:jc w:val="start"/>
               <w:rPr>
@@ -5013,6 +5145,7 @@
             <w:pPr>
               <w:pStyle w:val="Normal"/>
               <w:widowControl/>
+              <w:suppressAutoHyphens w:val="true"/>
               <w:spacing w:lineRule="auto" w:line="240" w:before="0" w:after="0"/>
               <w:jc w:val="start"/>
               <w:rPr>
@@ -5042,6 +5175,7 @@
             <w:pPr>
               <w:pStyle w:val="Normal"/>
               <w:widowControl/>
+              <w:suppressAutoHyphens w:val="true"/>
               <w:spacing w:lineRule="auto" w:line="240" w:before="0" w:after="0"/>
               <w:jc w:val="start"/>
               <w:rPr>
@@ -5071,6 +5205,7 @@
             <w:pPr>
               <w:pStyle w:val="Normal"/>
               <w:widowControl/>
+              <w:suppressAutoHyphens w:val="true"/>
               <w:spacing w:lineRule="auto" w:line="240" w:before="0" w:after="0"/>
               <w:jc w:val="start"/>
               <w:rPr>
@@ -5100,6 +5235,7 @@
             <w:pPr>
               <w:pStyle w:val="Normal"/>
               <w:widowControl/>
+              <w:suppressAutoHyphens w:val="true"/>
               <w:spacing w:lineRule="auto" w:line="240" w:before="0" w:after="0"/>
               <w:jc w:val="start"/>
               <w:rPr>
@@ -5132,6 +5268,7 @@
             <w:pPr>
               <w:pStyle w:val="Normal"/>
               <w:widowControl/>
+              <w:suppressAutoHyphens w:val="true"/>
               <w:spacing w:lineRule="auto" w:line="240" w:before="0" w:after="0"/>
               <w:jc w:val="start"/>
               <w:rPr>
@@ -5161,6 +5298,7 @@
             <w:pPr>
               <w:pStyle w:val="Normal"/>
               <w:widowControl/>
+              <w:suppressAutoHyphens w:val="true"/>
               <w:spacing w:lineRule="auto" w:line="240" w:before="0" w:after="0"/>
               <w:jc w:val="start"/>
               <w:rPr>
@@ -5190,6 +5328,7 @@
             <w:pPr>
               <w:pStyle w:val="Normal"/>
               <w:widowControl/>
+              <w:suppressAutoHyphens w:val="true"/>
               <w:spacing w:lineRule="auto" w:line="240" w:before="0" w:after="0"/>
               <w:jc w:val="start"/>
               <w:rPr>
@@ -5219,6 +5358,7 @@
             <w:pPr>
               <w:pStyle w:val="Normal"/>
               <w:widowControl/>
+              <w:suppressAutoHyphens w:val="true"/>
               <w:spacing w:lineRule="auto" w:line="240" w:before="0" w:after="0"/>
               <w:jc w:val="start"/>
               <w:rPr>
@@ -5777,6 +5917,7 @@
             <w:pPr>
               <w:pStyle w:val="Normal"/>
               <w:widowControl/>
+              <w:suppressAutoHyphens w:val="true"/>
               <w:spacing w:lineRule="auto" w:line="240" w:before="0" w:after="0"/>
               <w:jc w:val="start"/>
               <w:rPr>
@@ -5808,6 +5949,7 @@
             <w:pPr>
               <w:pStyle w:val="Normal"/>
               <w:widowControl/>
+              <w:suppressAutoHyphens w:val="true"/>
               <w:spacing w:lineRule="auto" w:line="240" w:before="0" w:after="0"/>
               <w:jc w:val="start"/>
               <w:rPr>
@@ -5841,6 +5983,7 @@
             <w:pPr>
               <w:pStyle w:val="Normal"/>
               <w:widowControl/>
+              <w:suppressAutoHyphens w:val="true"/>
               <w:spacing w:lineRule="auto" w:line="240" w:before="0" w:after="0"/>
               <w:jc w:val="start"/>
               <w:rPr>
@@ -5870,6 +6013,7 @@
             <w:pPr>
               <w:pStyle w:val="Normal"/>
               <w:widowControl/>
+              <w:suppressAutoHyphens w:val="true"/>
               <w:spacing w:lineRule="auto" w:line="240" w:before="0" w:after="0"/>
               <w:jc w:val="start"/>
               <w:rPr>
@@ -5902,6 +6046,7 @@
             <w:pPr>
               <w:pStyle w:val="Normal"/>
               <w:widowControl/>
+              <w:suppressAutoHyphens w:val="true"/>
               <w:spacing w:lineRule="auto" w:line="240" w:before="0" w:after="0"/>
               <w:jc w:val="start"/>
               <w:rPr>
@@ -5931,6 +6076,7 @@
             <w:pPr>
               <w:pStyle w:val="Normal"/>
               <w:widowControl/>
+              <w:suppressAutoHyphens w:val="true"/>
               <w:spacing w:lineRule="auto" w:line="240" w:before="0" w:after="0"/>
               <w:jc w:val="start"/>
               <w:rPr>
@@ -5963,6 +6109,7 @@
             <w:pPr>
               <w:pStyle w:val="Normal"/>
               <w:widowControl/>
+              <w:suppressAutoHyphens w:val="true"/>
               <w:spacing w:lineRule="auto" w:line="240" w:before="0" w:after="0"/>
               <w:jc w:val="start"/>
               <w:rPr>
@@ -5992,6 +6139,7 @@
             <w:pPr>
               <w:pStyle w:val="Normal"/>
               <w:widowControl/>
+              <w:suppressAutoHyphens w:val="true"/>
               <w:spacing w:lineRule="auto" w:line="240" w:before="0" w:after="0"/>
               <w:jc w:val="start"/>
               <w:rPr>
@@ -6024,6 +6172,7 @@
             <w:pPr>
               <w:pStyle w:val="Normal"/>
               <w:widowControl/>
+              <w:suppressAutoHyphens w:val="true"/>
               <w:spacing w:lineRule="auto" w:line="240" w:before="0" w:after="0"/>
               <w:jc w:val="start"/>
               <w:rPr>
@@ -6053,6 +6202,7 @@
             <w:pPr>
               <w:pStyle w:val="Normal"/>
               <w:widowControl/>
+              <w:suppressAutoHyphens w:val="true"/>
               <w:spacing w:lineRule="auto" w:line="240" w:before="0" w:after="0"/>
               <w:jc w:val="start"/>
               <w:rPr>
@@ -6085,6 +6235,7 @@
             <w:pPr>
               <w:pStyle w:val="Normal"/>
               <w:widowControl/>
+              <w:suppressAutoHyphens w:val="true"/>
               <w:spacing w:lineRule="auto" w:line="240" w:before="0" w:after="0"/>
               <w:jc w:val="start"/>
               <w:rPr>
@@ -6114,6 +6265,7 @@
             <w:pPr>
               <w:pStyle w:val="Normal"/>
               <w:widowControl/>
+              <w:suppressAutoHyphens w:val="true"/>
               <w:spacing w:lineRule="auto" w:line="240" w:before="0" w:after="0"/>
               <w:jc w:val="start"/>
               <w:rPr>
@@ -6146,6 +6298,7 @@
             <w:pPr>
               <w:pStyle w:val="Normal"/>
               <w:widowControl/>
+              <w:suppressAutoHyphens w:val="true"/>
               <w:spacing w:lineRule="auto" w:line="240" w:before="0" w:after="0"/>
               <w:jc w:val="start"/>
               <w:rPr>
@@ -6175,6 +6328,7 @@
             <w:pPr>
               <w:pStyle w:val="Normal"/>
               <w:widowControl/>
+              <w:suppressAutoHyphens w:val="true"/>
               <w:spacing w:lineRule="auto" w:line="240" w:before="0" w:after="0"/>
               <w:jc w:val="start"/>
               <w:rPr>
@@ -6207,6 +6361,7 @@
             <w:pPr>
               <w:pStyle w:val="Normal"/>
               <w:widowControl/>
+              <w:suppressAutoHyphens w:val="true"/>
               <w:spacing w:lineRule="auto" w:line="240" w:before="0" w:after="0"/>
               <w:jc w:val="start"/>
               <w:rPr>
@@ -6236,6 +6391,7 @@
             <w:pPr>
               <w:pStyle w:val="Normal"/>
               <w:widowControl/>
+              <w:suppressAutoHyphens w:val="true"/>
               <w:spacing w:lineRule="auto" w:line="240" w:before="0" w:after="0"/>
               <w:jc w:val="start"/>
               <w:rPr>
@@ -6268,6 +6424,7 @@
             <w:pPr>
               <w:pStyle w:val="Normal"/>
               <w:widowControl/>
+              <w:suppressAutoHyphens w:val="true"/>
               <w:spacing w:lineRule="auto" w:line="240" w:before="0" w:after="0"/>
               <w:jc w:val="start"/>
               <w:rPr>
@@ -6297,6 +6454,7 @@
             <w:pPr>
               <w:pStyle w:val="Normal"/>
               <w:widowControl/>
+              <w:suppressAutoHyphens w:val="true"/>
               <w:spacing w:lineRule="auto" w:line="240" w:before="0" w:after="0"/>
               <w:jc w:val="start"/>
               <w:rPr>
@@ -6329,6 +6487,7 @@
             <w:pPr>
               <w:pStyle w:val="Normal"/>
               <w:widowControl/>
+              <w:suppressAutoHyphens w:val="true"/>
               <w:spacing w:lineRule="auto" w:line="240" w:before="0" w:after="0"/>
               <w:jc w:val="start"/>
               <w:rPr>
@@ -6358,6 +6517,7 @@
             <w:pPr>
               <w:pStyle w:val="Normal"/>
               <w:widowControl/>
+              <w:suppressAutoHyphens w:val="true"/>
               <w:spacing w:lineRule="auto" w:line="240" w:before="0" w:after="0"/>
               <w:jc w:val="start"/>
               <w:rPr>
@@ -7076,6 +7236,7 @@
             <w:pPr>
               <w:pStyle w:val="Normal"/>
               <w:widowControl/>
+              <w:suppressAutoHyphens w:val="true"/>
               <w:spacing w:lineRule="auto" w:line="240" w:before="0" w:after="0"/>
               <w:jc w:val="start"/>
               <w:rPr>
@@ -7107,6 +7268,7 @@
             <w:pPr>
               <w:pStyle w:val="Normal"/>
               <w:widowControl/>
+              <w:suppressAutoHyphens w:val="true"/>
               <w:spacing w:lineRule="auto" w:line="240" w:before="0" w:after="0"/>
               <w:jc w:val="start"/>
               <w:rPr>
@@ -7138,6 +7300,7 @@
             <w:pPr>
               <w:pStyle w:val="Normal"/>
               <w:widowControl/>
+              <w:suppressAutoHyphens w:val="true"/>
               <w:spacing w:lineRule="auto" w:line="240" w:before="0" w:after="0"/>
               <w:jc w:val="start"/>
               <w:rPr>
@@ -7171,6 +7334,7 @@
             <w:pPr>
               <w:pStyle w:val="Normal"/>
               <w:widowControl/>
+              <w:suppressAutoHyphens w:val="true"/>
               <w:spacing w:lineRule="auto" w:line="240" w:before="0" w:after="0"/>
               <w:jc w:val="start"/>
               <w:rPr>
@@ -7200,6 +7364,7 @@
             <w:pPr>
               <w:pStyle w:val="Normal"/>
               <w:widowControl/>
+              <w:suppressAutoHyphens w:val="true"/>
               <w:spacing w:lineRule="auto" w:line="240" w:before="0" w:after="0"/>
               <w:jc w:val="start"/>
               <w:rPr>
@@ -7229,6 +7394,7 @@
             <w:pPr>
               <w:pStyle w:val="Normal"/>
               <w:widowControl/>
+              <w:suppressAutoHyphens w:val="true"/>
               <w:spacing w:lineRule="auto" w:line="240" w:before="0" w:after="0"/>
               <w:jc w:val="start"/>
               <w:rPr>
@@ -7261,6 +7427,7 @@
             <w:pPr>
               <w:pStyle w:val="Normal"/>
               <w:widowControl/>
+              <w:suppressAutoHyphens w:val="true"/>
               <w:spacing w:lineRule="auto" w:line="240" w:before="0" w:after="0"/>
               <w:jc w:val="start"/>
               <w:rPr>
@@ -7290,6 +7457,7 @@
             <w:pPr>
               <w:pStyle w:val="Normal"/>
               <w:widowControl/>
+              <w:suppressAutoHyphens w:val="true"/>
               <w:spacing w:lineRule="auto" w:line="240" w:before="0" w:after="0"/>
               <w:jc w:val="start"/>
               <w:rPr>
@@ -7319,6 +7487,7 @@
             <w:pPr>
               <w:pStyle w:val="Normal"/>
               <w:widowControl/>
+              <w:suppressAutoHyphens w:val="true"/>
               <w:spacing w:lineRule="auto" w:line="240" w:before="0" w:after="0"/>
               <w:jc w:val="start"/>
               <w:rPr>
@@ -7351,6 +7520,7 @@
             <w:pPr>
               <w:pStyle w:val="Normal"/>
               <w:widowControl/>
+              <w:suppressAutoHyphens w:val="true"/>
               <w:spacing w:lineRule="auto" w:line="240" w:before="0" w:after="0"/>
               <w:jc w:val="start"/>
               <w:rPr>
@@ -7380,6 +7550,7 @@
             <w:pPr>
               <w:pStyle w:val="Normal"/>
               <w:widowControl/>
+              <w:suppressAutoHyphens w:val="true"/>
               <w:spacing w:lineRule="auto" w:line="240" w:before="0" w:after="0"/>
               <w:jc w:val="start"/>
               <w:rPr>
@@ -7409,6 +7580,7 @@
             <w:pPr>
               <w:pStyle w:val="Normal"/>
               <w:widowControl/>
+              <w:suppressAutoHyphens w:val="true"/>
               <w:spacing w:lineRule="auto" w:line="240" w:before="0" w:after="0"/>
               <w:jc w:val="start"/>
               <w:rPr>
@@ -7441,6 +7613,7 @@
             <w:pPr>
               <w:pStyle w:val="Normal"/>
               <w:widowControl/>
+              <w:suppressAutoHyphens w:val="true"/>
               <w:spacing w:lineRule="auto" w:line="240" w:before="0" w:after="0"/>
               <w:jc w:val="start"/>
               <w:rPr>
@@ -7470,6 +7643,7 @@
             <w:pPr>
               <w:pStyle w:val="Normal"/>
               <w:widowControl/>
+              <w:suppressAutoHyphens w:val="true"/>
               <w:spacing w:lineRule="auto" w:line="240" w:before="0" w:after="0"/>
               <w:jc w:val="start"/>
               <w:rPr>
@@ -7499,6 +7673,7 @@
             <w:pPr>
               <w:pStyle w:val="Normal"/>
               <w:widowControl/>
+              <w:suppressAutoHyphens w:val="true"/>
               <w:spacing w:lineRule="auto" w:line="240" w:before="0" w:after="0"/>
               <w:jc w:val="start"/>
               <w:rPr>
@@ -7531,6 +7706,7 @@
             <w:pPr>
               <w:pStyle w:val="Normal"/>
               <w:widowControl/>
+              <w:suppressAutoHyphens w:val="true"/>
               <w:spacing w:lineRule="auto" w:line="240" w:before="0" w:after="0"/>
               <w:jc w:val="start"/>
               <w:rPr>
@@ -7560,6 +7736,7 @@
             <w:pPr>
               <w:pStyle w:val="Normal"/>
               <w:widowControl/>
+              <w:suppressAutoHyphens w:val="true"/>
               <w:spacing w:lineRule="auto" w:line="240" w:before="0" w:after="0"/>
               <w:jc w:val="start"/>
               <w:rPr>
@@ -7589,6 +7766,7 @@
             <w:pPr>
               <w:pStyle w:val="Normal"/>
               <w:widowControl/>
+              <w:suppressAutoHyphens w:val="true"/>
               <w:spacing w:lineRule="auto" w:line="240" w:before="0" w:after="0"/>
               <w:jc w:val="start"/>
               <w:rPr>
@@ -7621,6 +7799,7 @@
             <w:pPr>
               <w:pStyle w:val="Normal"/>
               <w:widowControl/>
+              <w:suppressAutoHyphens w:val="true"/>
               <w:spacing w:lineRule="auto" w:line="240" w:before="0" w:after="0"/>
               <w:jc w:val="start"/>
               <w:rPr>
@@ -7650,6 +7829,7 @@
             <w:pPr>
               <w:pStyle w:val="Normal"/>
               <w:widowControl/>
+              <w:suppressAutoHyphens w:val="true"/>
               <w:spacing w:lineRule="auto" w:line="240" w:before="0" w:after="0"/>
               <w:jc w:val="start"/>
               <w:rPr>
@@ -7679,6 +7859,7 @@
             <w:pPr>
               <w:pStyle w:val="Normal"/>
               <w:widowControl/>
+              <w:suppressAutoHyphens w:val="true"/>
               <w:spacing w:lineRule="auto" w:line="240" w:before="0" w:after="0"/>
               <w:jc w:val="start"/>
               <w:rPr>
@@ -7711,6 +7892,7 @@
             <w:pPr>
               <w:pStyle w:val="Normal"/>
               <w:widowControl/>
+              <w:suppressAutoHyphens w:val="true"/>
               <w:spacing w:lineRule="auto" w:line="240" w:before="0" w:after="0"/>
               <w:jc w:val="start"/>
               <w:rPr>
@@ -7740,6 +7922,7 @@
             <w:pPr>
               <w:pStyle w:val="Normal"/>
               <w:widowControl/>
+              <w:suppressAutoHyphens w:val="true"/>
               <w:spacing w:lineRule="auto" w:line="240" w:before="0" w:after="0"/>
               <w:jc w:val="start"/>
               <w:rPr>
@@ -7769,6 +7952,7 @@
             <w:pPr>
               <w:pStyle w:val="Normal"/>
               <w:widowControl/>
+              <w:suppressAutoHyphens w:val="true"/>
               <w:spacing w:lineRule="auto" w:line="240" w:before="0" w:after="0"/>
               <w:jc w:val="start"/>
               <w:rPr>
@@ -7801,6 +7985,7 @@
             <w:pPr>
               <w:pStyle w:val="Normal"/>
               <w:widowControl/>
+              <w:suppressAutoHyphens w:val="true"/>
               <w:spacing w:lineRule="auto" w:line="240" w:before="0" w:after="0"/>
               <w:jc w:val="start"/>
               <w:rPr>
@@ -7830,6 +8015,7 @@
             <w:pPr>
               <w:pStyle w:val="Normal"/>
               <w:widowControl/>
+              <w:suppressAutoHyphens w:val="true"/>
               <w:spacing w:lineRule="auto" w:line="240" w:before="0" w:after="0"/>
               <w:jc w:val="start"/>
               <w:rPr>
@@ -7859,6 +8045,7 @@
             <w:pPr>
               <w:pStyle w:val="Normal"/>
               <w:widowControl/>
+              <w:suppressAutoHyphens w:val="true"/>
               <w:spacing w:lineRule="auto" w:line="240" w:before="0" w:after="0"/>
               <w:jc w:val="start"/>
               <w:rPr>
@@ -7995,6 +8182,7 @@
         </w:tabs>
         <w:ind w:start="1080" w:hanging="360"/>
       </w:pPr>
+      <w:rPr/>
     </w:lvl>
     <w:lvl w:ilvl="2">
       <w:start w:val="1"/>
@@ -8007,6 +8195,7 @@
         </w:tabs>
         <w:ind w:start="1440" w:hanging="360"/>
       </w:pPr>
+      <w:rPr/>
     </w:lvl>
     <w:lvl w:ilvl="3">
       <w:start w:val="1"/>
@@ -8019,6 +8208,7 @@
         </w:tabs>
         <w:ind w:start="1800" w:hanging="360"/>
       </w:pPr>
+      <w:rPr/>
     </w:lvl>
     <w:lvl w:ilvl="4">
       <w:start w:val="1"/>
@@ -8031,6 +8221,7 @@
         </w:tabs>
         <w:ind w:start="2160" w:hanging="360"/>
       </w:pPr>
+      <w:rPr/>
     </w:lvl>
     <w:lvl w:ilvl="5">
       <w:start w:val="1"/>
@@ -8043,6 +8234,7 @@
         </w:tabs>
         <w:ind w:start="2520" w:hanging="360"/>
       </w:pPr>
+      <w:rPr/>
     </w:lvl>
     <w:lvl w:ilvl="6">
       <w:start w:val="1"/>
@@ -8055,6 +8247,7 @@
         </w:tabs>
         <w:ind w:start="2880" w:hanging="360"/>
       </w:pPr>
+      <w:rPr/>
     </w:lvl>
     <w:lvl w:ilvl="7">
       <w:start w:val="1"/>
@@ -8067,6 +8260,7 @@
         </w:tabs>
         <w:ind w:start="3240" w:hanging="360"/>
       </w:pPr>
+      <w:rPr/>
     </w:lvl>
     <w:lvl w:ilvl="8">
       <w:start w:val="1"/>
@@ -8079,6 +8273,7 @@
         </w:tabs>
         <w:ind w:start="3600" w:hanging="360"/>
       </w:pPr>
+      <w:rPr/>
     </w:lvl>
   </w:abstractNum>
   <w:abstractNum w:abstractNumId="2">
@@ -8108,6 +8303,7 @@
         </w:tabs>
         <w:ind w:start="1080" w:hanging="360"/>
       </w:pPr>
+      <w:rPr/>
     </w:lvl>
     <w:lvl w:ilvl="2">
       <w:start w:val="1"/>
@@ -8120,6 +8316,7 @@
         </w:tabs>
         <w:ind w:start="1440" w:hanging="360"/>
       </w:pPr>
+      <w:rPr/>
     </w:lvl>
     <w:lvl w:ilvl="3">
       <w:start w:val="1"/>
@@ -8132,6 +8329,7 @@
         </w:tabs>
         <w:ind w:start="1800" w:hanging="360"/>
       </w:pPr>
+      <w:rPr/>
     </w:lvl>
     <w:lvl w:ilvl="4">
       <w:start w:val="1"/>
@@ -8144,6 +8342,7 @@
         </w:tabs>
         <w:ind w:start="2160" w:hanging="360"/>
       </w:pPr>
+      <w:rPr/>
     </w:lvl>
     <w:lvl w:ilvl="5">
       <w:start w:val="1"/>
@@ -8156,6 +8355,7 @@
         </w:tabs>
         <w:ind w:start="2520" w:hanging="360"/>
       </w:pPr>
+      <w:rPr/>
     </w:lvl>
     <w:lvl w:ilvl="6">
       <w:start w:val="1"/>
@@ -8168,6 +8368,7 @@
         </w:tabs>
         <w:ind w:start="2880" w:hanging="360"/>
       </w:pPr>
+      <w:rPr/>
     </w:lvl>
     <w:lvl w:ilvl="7">
       <w:start w:val="1"/>
@@ -8180,6 +8381,7 @@
         </w:tabs>
         <w:ind w:start="3240" w:hanging="360"/>
       </w:pPr>
+      <w:rPr/>
     </w:lvl>
     <w:lvl w:ilvl="8">
       <w:start w:val="1"/>
@@ -8192,6 +8394,7 @@
         </w:tabs>
         <w:ind w:start="3600" w:hanging="360"/>
       </w:pPr>
+      <w:rPr/>
     </w:lvl>
   </w:abstractNum>
   <w:abstractNum w:abstractNumId="3">
@@ -8221,6 +8424,7 @@
         </w:tabs>
         <w:ind w:start="1080" w:hanging="360"/>
       </w:pPr>
+      <w:rPr/>
     </w:lvl>
     <w:lvl w:ilvl="2">
       <w:start w:val="1"/>
@@ -8233,6 +8437,7 @@
         </w:tabs>
         <w:ind w:start="1440" w:hanging="360"/>
       </w:pPr>
+      <w:rPr/>
     </w:lvl>
     <w:lvl w:ilvl="3">
       <w:start w:val="1"/>
@@ -8245,6 +8450,7 @@
         </w:tabs>
         <w:ind w:start="1800" w:hanging="360"/>
       </w:pPr>
+      <w:rPr/>
     </w:lvl>
     <w:lvl w:ilvl="4">
       <w:start w:val="1"/>
@@ -8257,6 +8463,7 @@
         </w:tabs>
         <w:ind w:start="2160" w:hanging="360"/>
       </w:pPr>
+      <w:rPr/>
     </w:lvl>
     <w:lvl w:ilvl="5">
       <w:start w:val="1"/>
@@ -8269,6 +8476,7 @@
         </w:tabs>
         <w:ind w:start="2520" w:hanging="360"/>
       </w:pPr>
+      <w:rPr/>
     </w:lvl>
     <w:lvl w:ilvl="6">
       <w:start w:val="1"/>
@@ -8281,6 +8489,7 @@
         </w:tabs>
         <w:ind w:start="2880" w:hanging="360"/>
       </w:pPr>
+      <w:rPr/>
     </w:lvl>
     <w:lvl w:ilvl="7">
       <w:start w:val="1"/>
@@ -8293,6 +8502,7 @@
         </w:tabs>
         <w:ind w:start="3240" w:hanging="360"/>
       </w:pPr>
+      <w:rPr/>
     </w:lvl>
     <w:lvl w:ilvl="8">
       <w:start w:val="1"/>
@@ -8305,6 +8515,7 @@
         </w:tabs>
         <w:ind w:start="3600" w:hanging="360"/>
       </w:pPr>
+      <w:rPr/>
     </w:lvl>
   </w:abstractNum>
   <w:abstractNum w:abstractNumId="4">
@@ -8332,6 +8543,7 @@
         </w:tabs>
         <w:ind w:start="1080" w:hanging="360"/>
       </w:pPr>
+      <w:rPr/>
     </w:lvl>
     <w:lvl w:ilvl="2">
       <w:start w:val="1"/>
@@ -8344,6 +8556,7 @@
         </w:tabs>
         <w:ind w:start="1440" w:hanging="360"/>
       </w:pPr>
+      <w:rPr/>
     </w:lvl>
     <w:lvl w:ilvl="3">
       <w:start w:val="1"/>
@@ -8356,6 +8569,7 @@
         </w:tabs>
         <w:ind w:start="1800" w:hanging="360"/>
       </w:pPr>
+      <w:rPr/>
     </w:lvl>
     <w:lvl w:ilvl="4">
       <w:start w:val="1"/>
@@ -8368,6 +8582,7 @@
         </w:tabs>
         <w:ind w:start="2160" w:hanging="360"/>
       </w:pPr>
+      <w:rPr/>
     </w:lvl>
     <w:lvl w:ilvl="5">
       <w:start w:val="1"/>
@@ -8380,6 +8595,7 @@
         </w:tabs>
         <w:ind w:start="2520" w:hanging="360"/>
       </w:pPr>
+      <w:rPr/>
     </w:lvl>
     <w:lvl w:ilvl="6">
       <w:start w:val="1"/>
@@ -8392,6 +8608,7 @@
         </w:tabs>
         <w:ind w:start="2880" w:hanging="360"/>
       </w:pPr>
+      <w:rPr/>
     </w:lvl>
     <w:lvl w:ilvl="7">
       <w:start w:val="1"/>
@@ -8404,6 +8621,7 @@
         </w:tabs>
         <w:ind w:start="3240" w:hanging="360"/>
       </w:pPr>
+      <w:rPr/>
     </w:lvl>
     <w:lvl w:ilvl="8">
       <w:start w:val="1"/>
@@ -8416,6 +8634,7 @@
         </w:tabs>
         <w:ind w:start="3600" w:hanging="360"/>
       </w:pPr>
+      <w:rPr/>
     </w:lvl>
   </w:abstractNum>
   <w:abstractNum w:abstractNumId="5">
@@ -8443,6 +8662,7 @@
         </w:tabs>
         <w:ind w:start="1080" w:hanging="360"/>
       </w:pPr>
+      <w:rPr/>
     </w:lvl>
     <w:lvl w:ilvl="2">
       <w:start w:val="1"/>
@@ -8455,6 +8675,7 @@
         </w:tabs>
         <w:ind w:start="1440" w:hanging="360"/>
       </w:pPr>
+      <w:rPr/>
     </w:lvl>
     <w:lvl w:ilvl="3">
       <w:start w:val="1"/>
@@ -8467,6 +8688,7 @@
         </w:tabs>
         <w:ind w:start="1800" w:hanging="360"/>
       </w:pPr>
+      <w:rPr/>
     </w:lvl>
     <w:lvl w:ilvl="4">
       <w:start w:val="1"/>
@@ -8479,6 +8701,7 @@
         </w:tabs>
         <w:ind w:start="2160" w:hanging="360"/>
       </w:pPr>
+      <w:rPr/>
     </w:lvl>
     <w:lvl w:ilvl="5">
       <w:start w:val="1"/>
@@ -8491,6 +8714,7 @@
         </w:tabs>
         <w:ind w:start="2520" w:hanging="360"/>
       </w:pPr>
+      <w:rPr/>
     </w:lvl>
     <w:lvl w:ilvl="6">
       <w:start w:val="1"/>
@@ -8503,6 +8727,7 @@
         </w:tabs>
         <w:ind w:start="2880" w:hanging="360"/>
       </w:pPr>
+      <w:rPr/>
     </w:lvl>
     <w:lvl w:ilvl="7">
       <w:start w:val="1"/>
@@ -8515,6 +8740,7 @@
         </w:tabs>
         <w:ind w:start="3240" w:hanging="360"/>
       </w:pPr>
+      <w:rPr/>
     </w:lvl>
     <w:lvl w:ilvl="8">
       <w:start w:val="1"/>
@@ -8527,6 +8753,7 @@
         </w:tabs>
         <w:ind w:start="3600" w:hanging="360"/>
       </w:pPr>
+      <w:rPr/>
     </w:lvl>
   </w:abstractNum>
   <w:abstractNum w:abstractNumId="6">
@@ -8554,6 +8781,7 @@
         </w:tabs>
         <w:ind w:start="1080" w:hanging="360"/>
       </w:pPr>
+      <w:rPr/>
     </w:lvl>
     <w:lvl w:ilvl="2">
       <w:start w:val="1"/>
@@ -8566,6 +8794,7 @@
         </w:tabs>
         <w:ind w:start="1440" w:hanging="360"/>
       </w:pPr>
+      <w:rPr/>
     </w:lvl>
     <w:lvl w:ilvl="3">
       <w:start w:val="1"/>
@@ -8578,6 +8807,7 @@
         </w:tabs>
         <w:ind w:start="1800" w:hanging="360"/>
       </w:pPr>
+      <w:rPr/>
     </w:lvl>
     <w:lvl w:ilvl="4">
       <w:start w:val="1"/>
@@ -8590,6 +8820,7 @@
         </w:tabs>
         <w:ind w:start="2160" w:hanging="360"/>
       </w:pPr>
+      <w:rPr/>
     </w:lvl>
     <w:lvl w:ilvl="5">
       <w:start w:val="1"/>
@@ -8602,6 +8833,7 @@
         </w:tabs>
         <w:ind w:start="2520" w:hanging="360"/>
       </w:pPr>
+      <w:rPr/>
     </w:lvl>
     <w:lvl w:ilvl="6">
       <w:start w:val="1"/>
@@ -8614,6 +8846,7 @@
         </w:tabs>
         <w:ind w:start="2880" w:hanging="360"/>
       </w:pPr>
+      <w:rPr/>
     </w:lvl>
     <w:lvl w:ilvl="7">
       <w:start w:val="1"/>
@@ -8626,6 +8859,7 @@
         </w:tabs>
         <w:ind w:start="3240" w:hanging="360"/>
       </w:pPr>
+      <w:rPr/>
     </w:lvl>
     <w:lvl w:ilvl="8">
       <w:start w:val="1"/>
@@ -8638,6 +8872,7 @@
         </w:tabs>
         <w:ind w:start="3600" w:hanging="360"/>
       </w:pPr>
+      <w:rPr/>
     </w:lvl>
   </w:abstractNum>
   <w:abstractNum w:abstractNumId="7">
@@ -8788,7 +9023,7 @@
   <w:docDefaults>
     <w:rPrDefault>
       <w:rPr>
-        <w:rFonts w:ascii="Cambria" w:hAnsi="Cambria" w:eastAsia="ＭＳ 明朝" w:cs="" w:asciiTheme="minorHAnsi" w:cstheme="minorBidi" w:eastAsiaTheme="minorEastAsia" w:hAnsiTheme="minorHAnsi"/>
+        <w:rFonts w:ascii="Cambria" w:hAnsi="Cambria" w:eastAsia="" w:cs="" w:asciiTheme="minorHAnsi" w:cstheme="minorBidi" w:eastAsiaTheme="minorEastAsia" w:hAnsiTheme="minorHAnsi"/>
         <w:sz w:val="22"/>
         <w:szCs w:val="22"/>
         <w:lang w:val="en-US" w:eastAsia="en-US" w:bidi="ar-SA"/>
@@ -8945,6 +9180,7 @@
     <w:rsid w:val="00fc693f"/>
     <w:pPr>
       <w:widowControl/>
+      <w:suppressAutoHyphens w:val="true"/>
       <w:bidi w:val="0"/>
       <w:spacing w:lineRule="auto" w:line="276" w:before="0" w:after="200"/>
       <w:jc w:val="start"/>
@@ -8973,7 +9209,7 @@
       <w:outlineLvl w:val="0"/>
     </w:pPr>
     <w:rPr>
-      <w:rFonts w:ascii="Calibri" w:hAnsi="Calibri" w:eastAsia="ＭＳ ゴシック" w:cs="" w:asciiTheme="majorHAnsi" w:cstheme="majorBidi" w:eastAsiaTheme="majorEastAsia" w:hAnsiTheme="majorHAnsi"/>
+      <w:rFonts w:ascii="Calibri" w:hAnsi="Calibri" w:eastAsia="" w:cs="" w:asciiTheme="majorHAnsi" w:cstheme="majorBidi" w:eastAsiaTheme="majorEastAsia" w:hAnsiTheme="majorHAnsi"/>
       <w:b/>
       <w:bCs/>
       <w:color w:themeColor="accent1" w:themeShade="bf" w:val="365F91"/>
@@ -8997,7 +9233,7 @@
       <w:outlineLvl w:val="1"/>
     </w:pPr>
     <w:rPr>
-      <w:rFonts w:ascii="Calibri" w:hAnsi="Calibri" w:eastAsia="ＭＳ ゴシック" w:cs="" w:asciiTheme="majorHAnsi" w:cstheme="majorBidi" w:eastAsiaTheme="majorEastAsia" w:hAnsiTheme="majorHAnsi"/>
+      <w:rFonts w:ascii="Calibri" w:hAnsi="Calibri" w:eastAsia="" w:cs="" w:asciiTheme="majorHAnsi" w:cstheme="majorBidi" w:eastAsiaTheme="majorEastAsia" w:hAnsiTheme="majorHAnsi"/>
       <w:b/>
       <w:bCs/>
       <w:color w:themeColor="accent1" w:val="4F81BD"/>
@@ -9021,7 +9257,7 @@
       <w:outlineLvl w:val="2"/>
     </w:pPr>
     <w:rPr>
-      <w:rFonts w:ascii="Calibri" w:hAnsi="Calibri" w:eastAsia="ＭＳ ゴシック" w:cs="" w:asciiTheme="majorHAnsi" w:cstheme="majorBidi" w:eastAsiaTheme="majorEastAsia" w:hAnsiTheme="majorHAnsi"/>
+      <w:rFonts w:ascii="Calibri" w:hAnsi="Calibri" w:eastAsia="" w:cs="" w:asciiTheme="majorHAnsi" w:cstheme="majorBidi" w:eastAsiaTheme="majorEastAsia" w:hAnsiTheme="majorHAnsi"/>
       <w:b/>
       <w:bCs/>
       <w:color w:themeColor="accent1" w:val="4F81BD"/>
@@ -9044,7 +9280,7 @@
       <w:outlineLvl w:val="3"/>
     </w:pPr>
     <w:rPr>
-      <w:rFonts w:ascii="Calibri" w:hAnsi="Calibri" w:eastAsia="ＭＳ ゴシック" w:cs="" w:asciiTheme="majorHAnsi" w:cstheme="majorBidi" w:eastAsiaTheme="majorEastAsia" w:hAnsiTheme="majorHAnsi"/>
+      <w:rFonts w:ascii="Calibri" w:hAnsi="Calibri" w:eastAsia="" w:cs="" w:asciiTheme="majorHAnsi" w:cstheme="majorBidi" w:eastAsiaTheme="majorEastAsia" w:hAnsiTheme="majorHAnsi"/>
       <w:b/>
       <w:bCs/>
       <w:i/>
@@ -9069,7 +9305,7 @@
       <w:outlineLvl w:val="4"/>
     </w:pPr>
     <w:rPr>
-      <w:rFonts w:ascii="Calibri" w:hAnsi="Calibri" w:eastAsia="ＭＳ ゴシック" w:cs="" w:asciiTheme="majorHAnsi" w:cstheme="majorBidi" w:eastAsiaTheme="majorEastAsia" w:hAnsiTheme="majorHAnsi"/>
+      <w:rFonts w:ascii="Calibri" w:hAnsi="Calibri" w:eastAsia="" w:cs="" w:asciiTheme="majorHAnsi" w:cstheme="majorBidi" w:eastAsiaTheme="majorEastAsia" w:hAnsiTheme="majorHAnsi"/>
       <w:color w:themeColor="accent1" w:themeShade="7f" w:val="243F60"/>
     </w:rPr>
   </w:style>
@@ -9090,7 +9326,7 @@
       <w:outlineLvl w:val="5"/>
     </w:pPr>
     <w:rPr>
-      <w:rFonts w:ascii="Calibri" w:hAnsi="Calibri" w:eastAsia="ＭＳ ゴシック" w:cs="" w:asciiTheme="majorHAnsi" w:cstheme="majorBidi" w:eastAsiaTheme="majorEastAsia" w:hAnsiTheme="majorHAnsi"/>
+      <w:rFonts w:ascii="Calibri" w:hAnsi="Calibri" w:eastAsia="" w:cs="" w:asciiTheme="majorHAnsi" w:cstheme="majorBidi" w:eastAsiaTheme="majorEastAsia" w:hAnsiTheme="majorHAnsi"/>
       <w:i/>
       <w:iCs/>
       <w:color w:themeColor="accent1" w:themeShade="7f" w:val="243F60"/>
@@ -9113,7 +9349,7 @@
       <w:outlineLvl w:val="6"/>
     </w:pPr>
     <w:rPr>
-      <w:rFonts w:ascii="Calibri" w:hAnsi="Calibri" w:eastAsia="ＭＳ ゴシック" w:cs="" w:asciiTheme="majorHAnsi" w:cstheme="majorBidi" w:eastAsiaTheme="majorEastAsia" w:hAnsiTheme="majorHAnsi"/>
+      <w:rFonts w:ascii="Calibri" w:hAnsi="Calibri" w:eastAsia="" w:cs="" w:asciiTheme="majorHAnsi" w:cstheme="majorBidi" w:eastAsiaTheme="majorEastAsia" w:hAnsiTheme="majorHAnsi"/>
       <w:i/>
       <w:iCs/>
       <w:color w:themeColor="text1" w:themeTint="bf" w:val="404040"/>
@@ -9136,7 +9372,7 @@
       <w:outlineLvl w:val="7"/>
     </w:pPr>
     <w:rPr>
-      <w:rFonts w:ascii="Calibri" w:hAnsi="Calibri" w:eastAsia="ＭＳ ゴシック" w:cs="" w:asciiTheme="majorHAnsi" w:cstheme="majorBidi" w:eastAsiaTheme="majorEastAsia" w:hAnsiTheme="majorHAnsi"/>
+      <w:rFonts w:ascii="Calibri" w:hAnsi="Calibri" w:eastAsia="" w:cs="" w:asciiTheme="majorHAnsi" w:cstheme="majorBidi" w:eastAsiaTheme="majorEastAsia" w:hAnsiTheme="majorHAnsi"/>
       <w:color w:themeColor="accent1" w:val="4F81BD"/>
       <w:sz w:val="20"/>
       <w:szCs w:val="20"/>
@@ -9159,7 +9395,7 @@
       <w:outlineLvl w:val="8"/>
     </w:pPr>
     <w:rPr>
-      <w:rFonts w:ascii="Calibri" w:hAnsi="Calibri" w:eastAsia="ＭＳ ゴシック" w:cs="" w:asciiTheme="majorHAnsi" w:cstheme="majorBidi" w:eastAsiaTheme="majorEastAsia" w:hAnsiTheme="majorHAnsi"/>
+      <w:rFonts w:ascii="Calibri" w:hAnsi="Calibri" w:eastAsia="" w:cs="" w:asciiTheme="majorHAnsi" w:cstheme="majorBidi" w:eastAsiaTheme="majorEastAsia" w:hAnsiTheme="majorHAnsi"/>
       <w:i/>
       <w:iCs/>
       <w:color w:themeColor="text1" w:themeTint="bf" w:val="404040"/>
@@ -9201,7 +9437,7 @@
     <w:qFormat/>
     <w:rsid w:val="00fc693f"/>
     <w:rPr>
-      <w:rFonts w:ascii="Calibri" w:hAnsi="Calibri" w:eastAsia="ＭＳ ゴシック" w:cs="" w:asciiTheme="majorHAnsi" w:cstheme="majorBidi" w:eastAsiaTheme="majorEastAsia" w:hAnsiTheme="majorHAnsi"/>
+      <w:rFonts w:ascii="Calibri" w:hAnsi="Calibri" w:eastAsia="" w:cs="" w:asciiTheme="majorHAnsi" w:cstheme="majorBidi" w:eastAsiaTheme="majorEastAsia" w:hAnsiTheme="majorHAnsi"/>
       <w:b/>
       <w:bCs/>
       <w:color w:themeColor="accent1" w:themeShade="bf" w:val="365F91"/>
@@ -9217,7 +9453,7 @@
     <w:qFormat/>
     <w:rsid w:val="00fc693f"/>
     <w:rPr>
-      <w:rFonts w:ascii="Calibri" w:hAnsi="Calibri" w:eastAsia="ＭＳ ゴシック" w:cs="" w:asciiTheme="majorHAnsi" w:cstheme="majorBidi" w:eastAsiaTheme="majorEastAsia" w:hAnsiTheme="majorHAnsi"/>
+      <w:rFonts w:ascii="Calibri" w:hAnsi="Calibri" w:eastAsia="" w:cs="" w:asciiTheme="majorHAnsi" w:cstheme="majorBidi" w:eastAsiaTheme="majorEastAsia" w:hAnsiTheme="majorHAnsi"/>
       <w:b/>
       <w:bCs/>
       <w:color w:themeColor="accent1" w:val="4F81BD"/>
@@ -9233,7 +9469,7 @@
     <w:qFormat/>
     <w:rsid w:val="00fc693f"/>
     <w:rPr>
-      <w:rFonts w:ascii="Calibri" w:hAnsi="Calibri" w:eastAsia="ＭＳ ゴシック" w:cs="" w:asciiTheme="majorHAnsi" w:cstheme="majorBidi" w:eastAsiaTheme="majorEastAsia" w:hAnsiTheme="majorHAnsi"/>
+      <w:rFonts w:ascii="Calibri" w:hAnsi="Calibri" w:eastAsia="" w:cs="" w:asciiTheme="majorHAnsi" w:cstheme="majorBidi" w:eastAsiaTheme="majorEastAsia" w:hAnsiTheme="majorHAnsi"/>
       <w:b/>
       <w:bCs/>
       <w:color w:themeColor="accent1" w:val="4F81BD"/>
@@ -9247,7 +9483,7 @@
     <w:qFormat/>
     <w:rsid w:val="00fc693f"/>
     <w:rPr>
-      <w:rFonts w:ascii="Calibri" w:hAnsi="Calibri" w:eastAsia="ＭＳ ゴシック" w:cs="" w:asciiTheme="majorHAnsi" w:cstheme="majorBidi" w:eastAsiaTheme="majorEastAsia" w:hAnsiTheme="majorHAnsi"/>
+      <w:rFonts w:ascii="Calibri" w:hAnsi="Calibri" w:eastAsia="" w:cs="" w:asciiTheme="majorHAnsi" w:cstheme="majorBidi" w:eastAsiaTheme="majorEastAsia" w:hAnsiTheme="majorHAnsi"/>
       <w:color w:themeColor="text2" w:themeShade="bf" w:val="17365D"/>
       <w:spacing w:val="5"/>
       <w:kern w:val="2"/>
@@ -9263,7 +9499,7 @@
     <w:qFormat/>
     <w:rsid w:val="00fc693f"/>
     <w:rPr>
-      <w:rFonts w:ascii="Calibri" w:hAnsi="Calibri" w:eastAsia="ＭＳ ゴシック" w:cs="" w:asciiTheme="majorHAnsi" w:cstheme="majorBidi" w:eastAsiaTheme="majorEastAsia" w:hAnsiTheme="majorHAnsi"/>
+      <w:rFonts w:ascii="Calibri" w:hAnsi="Calibri" w:eastAsia="" w:cs="" w:asciiTheme="majorHAnsi" w:cstheme="majorBidi" w:eastAsiaTheme="majorEastAsia" w:hAnsiTheme="majorHAnsi"/>
       <w:i/>
       <w:iCs/>
       <w:color w:themeColor="accent1" w:val="4F81BD"/>
@@ -9336,7 +9572,7 @@
     <w:qFormat/>
     <w:rsid w:val="00fc693f"/>
     <w:rPr>
-      <w:rFonts w:ascii="Calibri" w:hAnsi="Calibri" w:eastAsia="ＭＳ ゴシック" w:cs="" w:asciiTheme="majorHAnsi" w:cstheme="majorBidi" w:eastAsiaTheme="majorEastAsia" w:hAnsiTheme="majorHAnsi"/>
+      <w:rFonts w:ascii="Calibri" w:hAnsi="Calibri" w:eastAsia="" w:cs="" w:asciiTheme="majorHAnsi" w:cstheme="majorBidi" w:eastAsiaTheme="majorEastAsia" w:hAnsiTheme="majorHAnsi"/>
       <w:b/>
       <w:bCs/>
       <w:i/>
@@ -9353,7 +9589,7 @@
     <w:qFormat/>
     <w:rsid w:val="00fc693f"/>
     <w:rPr>
-      <w:rFonts w:ascii="Calibri" w:hAnsi="Calibri" w:eastAsia="ＭＳ ゴシック" w:cs="" w:asciiTheme="majorHAnsi" w:cstheme="majorBidi" w:eastAsiaTheme="majorEastAsia" w:hAnsiTheme="majorHAnsi"/>
+      <w:rFonts w:ascii="Calibri" w:hAnsi="Calibri" w:eastAsia="" w:cs="" w:asciiTheme="majorHAnsi" w:cstheme="majorBidi" w:eastAsiaTheme="majorEastAsia" w:hAnsiTheme="majorHAnsi"/>
       <w:color w:themeColor="accent1" w:themeShade="7f" w:val="243F60"/>
     </w:rPr>
   </w:style>
@@ -9366,7 +9602,7 @@
     <w:qFormat/>
     <w:rsid w:val="00fc693f"/>
     <w:rPr>
-      <w:rFonts w:ascii="Calibri" w:hAnsi="Calibri" w:eastAsia="ＭＳ ゴシック" w:cs="" w:asciiTheme="majorHAnsi" w:cstheme="majorBidi" w:eastAsiaTheme="majorEastAsia" w:hAnsiTheme="majorHAnsi"/>
+      <w:rFonts w:ascii="Calibri" w:hAnsi="Calibri" w:eastAsia="" w:cs="" w:asciiTheme="majorHAnsi" w:cstheme="majorBidi" w:eastAsiaTheme="majorEastAsia" w:hAnsiTheme="majorHAnsi"/>
       <w:i/>
       <w:iCs/>
       <w:color w:themeColor="accent1" w:themeShade="7f" w:val="243F60"/>
@@ -9381,7 +9617,7 @@
     <w:qFormat/>
     <w:rsid w:val="00fc693f"/>
     <w:rPr>
-      <w:rFonts w:ascii="Calibri" w:hAnsi="Calibri" w:eastAsia="ＭＳ ゴシック" w:cs="" w:asciiTheme="majorHAnsi" w:cstheme="majorBidi" w:eastAsiaTheme="majorEastAsia" w:hAnsiTheme="majorHAnsi"/>
+      <w:rFonts w:ascii="Calibri" w:hAnsi="Calibri" w:eastAsia="" w:cs="" w:asciiTheme="majorHAnsi" w:cstheme="majorBidi" w:eastAsiaTheme="majorEastAsia" w:hAnsiTheme="majorHAnsi"/>
       <w:i/>
       <w:iCs/>
       <w:color w:themeColor="text1" w:themeTint="bf" w:val="404040"/>
@@ -9396,7 +9632,7 @@
     <w:qFormat/>
     <w:rsid w:val="00fc693f"/>
     <w:rPr>
-      <w:rFonts w:ascii="Calibri" w:hAnsi="Calibri" w:eastAsia="ＭＳ ゴシック" w:cs="" w:asciiTheme="majorHAnsi" w:cstheme="majorBidi" w:eastAsiaTheme="majorEastAsia" w:hAnsiTheme="majorHAnsi"/>
+      <w:rFonts w:ascii="Calibri" w:hAnsi="Calibri" w:eastAsia="" w:cs="" w:asciiTheme="majorHAnsi" w:cstheme="majorBidi" w:eastAsiaTheme="majorEastAsia" w:hAnsiTheme="majorHAnsi"/>
       <w:color w:themeColor="accent1" w:val="4F81BD"/>
       <w:sz w:val="20"/>
       <w:szCs w:val="20"/>
@@ -9411,7 +9647,7 @@
     <w:qFormat/>
     <w:rsid w:val="00fc693f"/>
     <w:rPr>
-      <w:rFonts w:ascii="Calibri" w:hAnsi="Calibri" w:eastAsia="ＭＳ ゴシック" w:cs="" w:asciiTheme="majorHAnsi" w:cstheme="majorBidi" w:eastAsiaTheme="majorEastAsia" w:hAnsiTheme="majorHAnsi"/>
+      <w:rFonts w:ascii="Calibri" w:hAnsi="Calibri" w:eastAsia="" w:cs="" w:asciiTheme="majorHAnsi" w:cstheme="majorBidi" w:eastAsiaTheme="majorEastAsia" w:hAnsiTheme="majorHAnsi"/>
       <w:i/>
       <w:iCs/>
       <w:color w:themeColor="text1" w:themeTint="bf" w:val="404040"/>
@@ -9641,12 +9877,13 @@
     <w:rsid w:val="00fc693f"/>
     <w:pPr>
       <w:widowControl/>
+      <w:suppressAutoHyphens w:val="true"/>
       <w:bidi w:val="0"/>
       <w:spacing w:lineRule="auto" w:line="240" w:before="0" w:after="0"/>
       <w:jc w:val="start"/>
     </w:pPr>
     <w:rPr>
-      <w:rFonts w:ascii="Cambria" w:hAnsi="Cambria" w:eastAsia="ＭＳ 明朝" w:cs="" w:asciiTheme="minorHAnsi" w:cstheme="minorBidi" w:eastAsiaTheme="minorEastAsia" w:hAnsiTheme="minorHAnsi"/>
+      <w:rFonts w:ascii="Cambria" w:hAnsi="Cambria" w:eastAsia="" w:cs="" w:asciiTheme="minorHAnsi" w:cstheme="minorBidi" w:eastAsiaTheme="minorEastAsia" w:hAnsiTheme="minorHAnsi"/>
       <w:color w:val="auto"/>
       <w:kern w:val="0"/>
       <w:sz w:val="22"/>
@@ -9670,7 +9907,7 @@
       <w:contextualSpacing/>
     </w:pPr>
     <w:rPr>
-      <w:rFonts w:ascii="Calibri" w:hAnsi="Calibri" w:eastAsia="ＭＳ ゴシック" w:cs="" w:asciiTheme="majorHAnsi" w:cstheme="majorBidi" w:eastAsiaTheme="majorEastAsia" w:hAnsiTheme="majorHAnsi"/>
+      <w:rFonts w:ascii="Calibri" w:hAnsi="Calibri" w:eastAsia="" w:cs="" w:asciiTheme="majorHAnsi" w:cstheme="majorBidi" w:eastAsiaTheme="majorEastAsia" w:hAnsiTheme="majorHAnsi"/>
       <w:color w:themeColor="text2" w:themeShade="bf" w:val="17365D"/>
       <w:spacing w:val="5"/>
       <w:kern w:val="2"/>
@@ -9688,7 +9925,7 @@
     <w:rsid w:val="00fc693f"/>
     <w:pPr/>
     <w:rPr>
-      <w:rFonts w:ascii="Calibri" w:hAnsi="Calibri" w:eastAsia="ＭＳ ゴシック" w:cs="" w:asciiTheme="majorHAnsi" w:cstheme="majorBidi" w:eastAsiaTheme="majorEastAsia" w:hAnsiTheme="majorHAnsi"/>
+      <w:rFonts w:ascii="Calibri" w:hAnsi="Calibri" w:eastAsia="" w:cs="" w:asciiTheme="majorHAnsi" w:cstheme="majorBidi" w:eastAsiaTheme="majorEastAsia" w:hAnsiTheme="majorHAnsi"/>
       <w:i/>
       <w:iCs/>
       <w:color w:themeColor="accent1" w:val="4F81BD"/>
@@ -9921,12 +10158,13 @@
         <w:tab w:val="left" w:pos="3456" w:leader="none"/>
         <w:tab w:val="left" w:pos="4032" w:leader="none"/>
       </w:tabs>
+      <w:suppressAutoHyphens w:val="true"/>
       <w:bidi w:val="0"/>
       <w:spacing w:lineRule="auto" w:line="276" w:before="0" w:after="200"/>
       <w:jc w:val="start"/>
     </w:pPr>
     <w:rPr>
-      <w:rFonts w:ascii="Courier" w:hAnsi="Courier" w:eastAsia="ＭＳ 明朝" w:cs="" w:cstheme="minorBidi" w:eastAsiaTheme="minorEastAsia"/>
+      <w:rFonts w:ascii="Courier" w:hAnsi="Courier" w:eastAsia="" w:cs="" w:cstheme="minorBidi" w:eastAsiaTheme="minorEastAsia"/>
       <w:color w:val="auto"/>
       <w:kern w:val="0"/>
       <w:sz w:val="20"/>
@@ -9997,6 +10235,7 @@
     <w:qFormat/>
     <w:pPr>
       <w:widowControl/>
+      <w:suppressAutoHyphens w:val="true"/>
       <w:bidi w:val="0"/>
       <w:spacing w:lineRule="auto" w:line="276" w:before="0" w:after="200"/>
       <w:jc w:val="start"/>
@@ -10015,12 +10254,13 @@
     <w:qFormat/>
     <w:pPr>
       <w:widowControl/>
+      <w:suppressAutoHyphens w:val="true"/>
       <w:bidi w:val="0"/>
       <w:spacing w:lineRule="auto" w:line="276" w:before="0" w:after="200"/>
       <w:jc w:val="start"/>
     </w:pPr>
     <w:rPr>
-      <w:rFonts w:ascii="Arial" w:hAnsi="Arial" w:eastAsia="ＭＳ 明朝" w:cs="" w:cstheme="minorBidi" w:eastAsiaTheme="minorEastAsia"/>
+      <w:rFonts w:ascii="Arial" w:hAnsi="Arial" w:eastAsia="" w:cs="" w:cstheme="minorBidi" w:eastAsiaTheme="minorEastAsia"/>
       <w:color w:val="auto"/>
       <w:kern w:val="0"/>
       <w:sz w:val="19"/>
@@ -13160,7 +13400,6 @@
       <w:pPr>
         <w:spacing w:before="0" w:after="0" w:line="240" w:lineRule="auto"/>
       </w:pPr>
-      <w:rPr/>
       <w:tblPr/>
       <w:tcPr>
         <w:tcBorders>
@@ -13306,7 +13545,6 @@
       <w:pPr>
         <w:spacing w:before="0" w:after="0" w:line="240" w:lineRule="auto"/>
       </w:pPr>
-      <w:rPr/>
       <w:tblPr/>
       <w:tcPr>
         <w:tcBorders>
@@ -13452,7 +13690,6 @@
       <w:pPr>
         <w:spacing w:before="0" w:after="0" w:line="240" w:lineRule="auto"/>
       </w:pPr>
-      <w:rPr/>
       <w:tblPr/>
       <w:tcPr>
         <w:tcBorders>
@@ -13598,7 +13835,6 @@
       <w:pPr>
         <w:spacing w:before="0" w:after="0" w:line="240" w:lineRule="auto"/>
       </w:pPr>
-      <w:rPr/>
       <w:tblPr/>
       <w:tcPr>
         <w:tcBorders>
@@ -13744,7 +13980,6 @@
       <w:pPr>
         <w:spacing w:before="0" w:after="0" w:line="240" w:lineRule="auto"/>
       </w:pPr>
-      <w:rPr/>
       <w:tblPr/>
       <w:tcPr>
         <w:tcBorders>
@@ -13890,7 +14125,6 @@
       <w:pPr>
         <w:spacing w:before="0" w:after="0" w:line="240" w:lineRule="auto"/>
       </w:pPr>
-      <w:rPr/>
       <w:tblPr/>
       <w:tcPr>
         <w:tcBorders>
@@ -14036,7 +14270,6 @@
       <w:pPr>
         <w:spacing w:before="0" w:after="0" w:line="240" w:lineRule="auto"/>
       </w:pPr>
-      <w:rPr/>
       <w:tblPr/>
       <w:tcPr>
         <w:tcBorders>

</xml_diff>